<commit_message>
assessments(s1-cl1): implement institutional review feedback
Update the AT1/AT2/AT3 student + assessor instruments and the CL1 delivery
plan per feedback from the S1 CL1 institutional review process.

Co-Authored-By: Claude Opus 4.8 (1M context) <noreply@anthropic.com>
</commit_message>
<xml_diff>
--- a/S1-CL1-Cloud-Design-Build/assessments/AT1/AT1-BusinessCase-Assessor.docx
+++ b/S1-CL1-Cloud-Design-Build/assessments/AT1/AT1-BusinessCase-Assessor.docx
@@ -292,7 +292,11 @@
             </w:tcBorders>
             <w:vAlign w:val="center"/>
           </w:tcPr>
-          <w:p/>
+          <w:p>
+            <w:r>
+              <w:t>End of Class 12</w:t>
+            </w:r>
+          </w:p>
         </w:tc>
       </w:tr>
       <w:tr>
@@ -873,6 +877,14 @@
             <w:pPr>
               <w:pStyle w:val="Assessortext"/>
             </w:pPr>
+            <w:r>
+              <w:rPr>
+                <w:color w:val="000000" w:themeColor="text1"/>
+                <w:sz w:val="20"/>
+                <w:szCs w:val="20"/>
+              </w:rPr>
+              <w:t>5 class sessions (#8-#12 inclusive) and the after-hours time in between</w:t>
+            </w:r>
           </w:p>
         </w:tc>
       </w:tr>
@@ -1780,23 +1792,7 @@
                 <w:sz w:val="20"/>
                 <w:szCs w:val="20"/>
               </w:rPr>
-              <w:t xml:space="preserve">☐ </w:t>
-            </w:r>
-            <w:proofErr w:type="gramStart"/>
-            <w:r>
-              <w:rPr>
-                <w:sz w:val="20"/>
-                <w:szCs w:val="20"/>
-              </w:rPr>
-              <w:t>Yes  ☐</w:t>
-            </w:r>
-            <w:proofErr w:type="gramEnd"/>
-            <w:r>
-              <w:rPr>
-                <w:sz w:val="20"/>
-                <w:szCs w:val="20"/>
-              </w:rPr>
-              <w:t xml:space="preserve"> No</w:t>
+              <w:t>☐ Yes  ☐ No</w:t>
             </w:r>
           </w:p>
         </w:tc>
@@ -1853,23 +1849,7 @@
                 <w:sz w:val="20"/>
                 <w:szCs w:val="20"/>
               </w:rPr>
-              <w:t xml:space="preserve">☐ </w:t>
-            </w:r>
-            <w:proofErr w:type="gramStart"/>
-            <w:r>
-              <w:rPr>
-                <w:sz w:val="20"/>
-                <w:szCs w:val="20"/>
-              </w:rPr>
-              <w:t>Yes  ☐</w:t>
-            </w:r>
-            <w:proofErr w:type="gramEnd"/>
-            <w:r>
-              <w:rPr>
-                <w:sz w:val="20"/>
-                <w:szCs w:val="20"/>
-              </w:rPr>
-              <w:t xml:space="preserve"> No</w:t>
+              <w:t>☐ Yes  ☐ No</w:t>
             </w:r>
           </w:p>
         </w:tc>
@@ -1926,23 +1906,7 @@
                 <w:sz w:val="20"/>
                 <w:szCs w:val="20"/>
               </w:rPr>
-              <w:t xml:space="preserve">☐ </w:t>
-            </w:r>
-            <w:proofErr w:type="gramStart"/>
-            <w:r>
-              <w:rPr>
-                <w:sz w:val="20"/>
-                <w:szCs w:val="20"/>
-              </w:rPr>
-              <w:t>Yes  ☐</w:t>
-            </w:r>
-            <w:proofErr w:type="gramEnd"/>
-            <w:r>
-              <w:rPr>
-                <w:sz w:val="20"/>
-                <w:szCs w:val="20"/>
-              </w:rPr>
-              <w:t xml:space="preserve"> No</w:t>
+              <w:t>☐ Yes  ☐ No</w:t>
             </w:r>
           </w:p>
         </w:tc>
@@ -1999,23 +1963,7 @@
                 <w:sz w:val="20"/>
                 <w:szCs w:val="20"/>
               </w:rPr>
-              <w:t xml:space="preserve">☐ </w:t>
-            </w:r>
-            <w:proofErr w:type="gramStart"/>
-            <w:r>
-              <w:rPr>
-                <w:sz w:val="20"/>
-                <w:szCs w:val="20"/>
-              </w:rPr>
-              <w:t>Yes  ☐</w:t>
-            </w:r>
-            <w:proofErr w:type="gramEnd"/>
-            <w:r>
-              <w:rPr>
-                <w:sz w:val="20"/>
-                <w:szCs w:val="20"/>
-              </w:rPr>
-              <w:t xml:space="preserve"> No</w:t>
+              <w:t>☐ Yes  ☐ No</w:t>
             </w:r>
           </w:p>
         </w:tc>
@@ -2072,23 +2020,7 @@
                 <w:sz w:val="20"/>
                 <w:szCs w:val="20"/>
               </w:rPr>
-              <w:t xml:space="preserve">☐ </w:t>
-            </w:r>
-            <w:proofErr w:type="gramStart"/>
-            <w:r>
-              <w:rPr>
-                <w:sz w:val="20"/>
-                <w:szCs w:val="20"/>
-              </w:rPr>
-              <w:t>Yes  ☐</w:t>
-            </w:r>
-            <w:proofErr w:type="gramEnd"/>
-            <w:r>
-              <w:rPr>
-                <w:sz w:val="20"/>
-                <w:szCs w:val="20"/>
-              </w:rPr>
-              <w:t xml:space="preserve"> No</w:t>
+              <w:t>☐ Yes  ☐ No</w:t>
             </w:r>
           </w:p>
         </w:tc>
@@ -2145,23 +2077,7 @@
                 <w:sz w:val="20"/>
                 <w:szCs w:val="20"/>
               </w:rPr>
-              <w:t xml:space="preserve">☐ </w:t>
-            </w:r>
-            <w:proofErr w:type="gramStart"/>
-            <w:r>
-              <w:rPr>
-                <w:sz w:val="20"/>
-                <w:szCs w:val="20"/>
-              </w:rPr>
-              <w:t>Yes  ☐</w:t>
-            </w:r>
-            <w:proofErr w:type="gramEnd"/>
-            <w:r>
-              <w:rPr>
-                <w:sz w:val="20"/>
-                <w:szCs w:val="20"/>
-              </w:rPr>
-              <w:t xml:space="preserve"> No</w:t>
+              <w:t>☐ Yes  ☐ No</w:t>
             </w:r>
           </w:p>
         </w:tc>
@@ -2218,23 +2134,7 @@
                 <w:sz w:val="20"/>
                 <w:szCs w:val="20"/>
               </w:rPr>
-              <w:t xml:space="preserve">☐ </w:t>
-            </w:r>
-            <w:proofErr w:type="gramStart"/>
-            <w:r>
-              <w:rPr>
-                <w:sz w:val="20"/>
-                <w:szCs w:val="20"/>
-              </w:rPr>
-              <w:t>Yes  ☐</w:t>
-            </w:r>
-            <w:proofErr w:type="gramEnd"/>
-            <w:r>
-              <w:rPr>
-                <w:sz w:val="20"/>
-                <w:szCs w:val="20"/>
-              </w:rPr>
-              <w:t xml:space="preserve"> No</w:t>
+              <w:t>☐ Yes  ☐ No</w:t>
             </w:r>
           </w:p>
         </w:tc>
@@ -2291,23 +2191,7 @@
                 <w:sz w:val="20"/>
                 <w:szCs w:val="20"/>
               </w:rPr>
-              <w:t xml:space="preserve">☐ </w:t>
-            </w:r>
-            <w:proofErr w:type="gramStart"/>
-            <w:r>
-              <w:rPr>
-                <w:sz w:val="20"/>
-                <w:szCs w:val="20"/>
-              </w:rPr>
-              <w:t>Yes  ☐</w:t>
-            </w:r>
-            <w:proofErr w:type="gramEnd"/>
-            <w:r>
-              <w:rPr>
-                <w:sz w:val="20"/>
-                <w:szCs w:val="20"/>
-              </w:rPr>
-              <w:t xml:space="preserve"> No</w:t>
+              <w:t>☐ Yes  ☐ No</w:t>
             </w:r>
           </w:p>
         </w:tc>
@@ -2364,23 +2248,7 @@
                 <w:sz w:val="20"/>
                 <w:szCs w:val="20"/>
               </w:rPr>
-              <w:t xml:space="preserve">☐ </w:t>
-            </w:r>
-            <w:proofErr w:type="gramStart"/>
-            <w:r>
-              <w:rPr>
-                <w:sz w:val="20"/>
-                <w:szCs w:val="20"/>
-              </w:rPr>
-              <w:t>Yes  ☐</w:t>
-            </w:r>
-            <w:proofErr w:type="gramEnd"/>
-            <w:r>
-              <w:rPr>
-                <w:sz w:val="20"/>
-                <w:szCs w:val="20"/>
-              </w:rPr>
-              <w:t xml:space="preserve"> No</w:t>
+              <w:t>☐ Yes  ☐ No</w:t>
             </w:r>
           </w:p>
         </w:tc>
@@ -2439,23 +2307,7 @@
                 <w:szCs w:val="20"/>
               </w:rPr>
               <w:lastRenderedPageBreak/>
-              <w:t xml:space="preserve">☐ </w:t>
-            </w:r>
-            <w:proofErr w:type="gramStart"/>
-            <w:r>
-              <w:rPr>
-                <w:sz w:val="20"/>
-                <w:szCs w:val="20"/>
-              </w:rPr>
-              <w:t>Yes  ☐</w:t>
-            </w:r>
-            <w:proofErr w:type="gramEnd"/>
-            <w:r>
-              <w:rPr>
-                <w:sz w:val="20"/>
-                <w:szCs w:val="20"/>
-              </w:rPr>
-              <w:t xml:space="preserve"> No</w:t>
+              <w:t>☐ Yes  ☐ No</w:t>
             </w:r>
           </w:p>
         </w:tc>
@@ -2512,23 +2364,7 @@
                 <w:sz w:val="20"/>
                 <w:szCs w:val="20"/>
               </w:rPr>
-              <w:t xml:space="preserve">☐ </w:t>
-            </w:r>
-            <w:proofErr w:type="gramStart"/>
-            <w:r>
-              <w:rPr>
-                <w:sz w:val="20"/>
-                <w:szCs w:val="20"/>
-              </w:rPr>
-              <w:t>Yes  ☐</w:t>
-            </w:r>
-            <w:proofErr w:type="gramEnd"/>
-            <w:r>
-              <w:rPr>
-                <w:sz w:val="20"/>
-                <w:szCs w:val="20"/>
-              </w:rPr>
-              <w:t xml:space="preserve"> No</w:t>
+              <w:t>☐ Yes  ☐ No</w:t>
             </w:r>
           </w:p>
         </w:tc>
@@ -2585,23 +2421,7 @@
                 <w:sz w:val="20"/>
                 <w:szCs w:val="20"/>
               </w:rPr>
-              <w:t xml:space="preserve">☐ </w:t>
-            </w:r>
-            <w:proofErr w:type="gramStart"/>
-            <w:r>
-              <w:rPr>
-                <w:sz w:val="20"/>
-                <w:szCs w:val="20"/>
-              </w:rPr>
-              <w:t>Yes  ☐</w:t>
-            </w:r>
-            <w:proofErr w:type="gramEnd"/>
-            <w:r>
-              <w:rPr>
-                <w:sz w:val="20"/>
-                <w:szCs w:val="20"/>
-              </w:rPr>
-              <w:t xml:space="preserve"> No</w:t>
+              <w:t>☐ Yes  ☐ No</w:t>
             </w:r>
           </w:p>
         </w:tc>
@@ -2658,23 +2478,7 @@
                 <w:sz w:val="20"/>
                 <w:szCs w:val="20"/>
               </w:rPr>
-              <w:t xml:space="preserve">☐ </w:t>
-            </w:r>
-            <w:proofErr w:type="gramStart"/>
-            <w:r>
-              <w:rPr>
-                <w:sz w:val="20"/>
-                <w:szCs w:val="20"/>
-              </w:rPr>
-              <w:t>Yes  ☐</w:t>
-            </w:r>
-            <w:proofErr w:type="gramEnd"/>
-            <w:r>
-              <w:rPr>
-                <w:sz w:val="20"/>
-                <w:szCs w:val="20"/>
-              </w:rPr>
-              <w:t xml:space="preserve"> No</w:t>
+              <w:t>☐ Yes  ☐ No</w:t>
             </w:r>
           </w:p>
         </w:tc>
@@ -2731,23 +2535,7 @@
                 <w:sz w:val="20"/>
                 <w:szCs w:val="20"/>
               </w:rPr>
-              <w:t xml:space="preserve">☐ </w:t>
-            </w:r>
-            <w:proofErr w:type="gramStart"/>
-            <w:r>
-              <w:rPr>
-                <w:sz w:val="20"/>
-                <w:szCs w:val="20"/>
-              </w:rPr>
-              <w:t>Yes  ☐</w:t>
-            </w:r>
-            <w:proofErr w:type="gramEnd"/>
-            <w:r>
-              <w:rPr>
-                <w:sz w:val="20"/>
-                <w:szCs w:val="20"/>
-              </w:rPr>
-              <w:t xml:space="preserve"> No</w:t>
+              <w:t>☐ Yes  ☐ No</w:t>
             </w:r>
           </w:p>
         </w:tc>
@@ -2840,23 +2628,7 @@
                 <w:sz w:val="20"/>
                 <w:szCs w:val="20"/>
               </w:rPr>
-              <w:t xml:space="preserve">☐ </w:t>
-            </w:r>
-            <w:proofErr w:type="gramStart"/>
-            <w:r>
-              <w:rPr>
-                <w:sz w:val="20"/>
-                <w:szCs w:val="20"/>
-              </w:rPr>
-              <w:t>Yes  ☐</w:t>
-            </w:r>
-            <w:proofErr w:type="gramEnd"/>
-            <w:r>
-              <w:rPr>
-                <w:sz w:val="20"/>
-                <w:szCs w:val="20"/>
-              </w:rPr>
-              <w:t xml:space="preserve"> No</w:t>
+              <w:t>☐ Yes  ☐ No</w:t>
             </w:r>
           </w:p>
         </w:tc>
@@ -2913,23 +2685,7 @@
                 <w:sz w:val="20"/>
                 <w:szCs w:val="20"/>
               </w:rPr>
-              <w:t xml:space="preserve">☐ </w:t>
-            </w:r>
-            <w:proofErr w:type="gramStart"/>
-            <w:r>
-              <w:rPr>
-                <w:sz w:val="20"/>
-                <w:szCs w:val="20"/>
-              </w:rPr>
-              <w:t>Yes  ☐</w:t>
-            </w:r>
-            <w:proofErr w:type="gramEnd"/>
-            <w:r>
-              <w:rPr>
-                <w:sz w:val="20"/>
-                <w:szCs w:val="20"/>
-              </w:rPr>
-              <w:t xml:space="preserve"> No</w:t>
+              <w:t>☐ Yes  ☐ No</w:t>
             </w:r>
           </w:p>
         </w:tc>
@@ -2986,23 +2742,7 @@
                 <w:sz w:val="20"/>
                 <w:szCs w:val="20"/>
               </w:rPr>
-              <w:t xml:space="preserve">☐ </w:t>
-            </w:r>
-            <w:proofErr w:type="gramStart"/>
-            <w:r>
-              <w:rPr>
-                <w:sz w:val="20"/>
-                <w:szCs w:val="20"/>
-              </w:rPr>
-              <w:t>Yes  ☐</w:t>
-            </w:r>
-            <w:proofErr w:type="gramEnd"/>
-            <w:r>
-              <w:rPr>
-                <w:sz w:val="20"/>
-                <w:szCs w:val="20"/>
-              </w:rPr>
-              <w:t xml:space="preserve"> No</w:t>
+              <w:t>☐ Yes  ☐ No</w:t>
             </w:r>
           </w:p>
         </w:tc>
@@ -3044,23 +2784,7 @@
                 <w:sz w:val="20"/>
                 <w:szCs w:val="20"/>
               </w:rPr>
-              <w:t xml:space="preserve">☐ </w:t>
-            </w:r>
-            <w:proofErr w:type="gramStart"/>
-            <w:r>
-              <w:rPr>
-                <w:sz w:val="20"/>
-                <w:szCs w:val="20"/>
-              </w:rPr>
-              <w:t>Yes  ☐</w:t>
-            </w:r>
-            <w:proofErr w:type="gramEnd"/>
-            <w:r>
-              <w:rPr>
-                <w:sz w:val="20"/>
-                <w:szCs w:val="20"/>
-              </w:rPr>
-              <w:t xml:space="preserve"> No</w:t>
+              <w:t>☐ Yes  ☐ No</w:t>
             </w:r>
           </w:p>
         </w:tc>
@@ -3102,23 +2826,7 @@
                 <w:sz w:val="20"/>
                 <w:szCs w:val="20"/>
               </w:rPr>
-              <w:t xml:space="preserve">☐ </w:t>
-            </w:r>
-            <w:proofErr w:type="gramStart"/>
-            <w:r>
-              <w:rPr>
-                <w:sz w:val="20"/>
-                <w:szCs w:val="20"/>
-              </w:rPr>
-              <w:t>Yes  ☐</w:t>
-            </w:r>
-            <w:proofErr w:type="gramEnd"/>
-            <w:r>
-              <w:rPr>
-                <w:sz w:val="20"/>
-                <w:szCs w:val="20"/>
-              </w:rPr>
-              <w:t xml:space="preserve"> No</w:t>
+              <w:t>☐ Yes  ☐ No</w:t>
             </w:r>
           </w:p>
         </w:tc>
@@ -3160,23 +2868,7 @@
                 <w:sz w:val="20"/>
                 <w:szCs w:val="20"/>
               </w:rPr>
-              <w:t xml:space="preserve">☐ </w:t>
-            </w:r>
-            <w:proofErr w:type="gramStart"/>
-            <w:r>
-              <w:rPr>
-                <w:sz w:val="20"/>
-                <w:szCs w:val="20"/>
-              </w:rPr>
-              <w:t>Yes  ☐</w:t>
-            </w:r>
-            <w:proofErr w:type="gramEnd"/>
-            <w:r>
-              <w:rPr>
-                <w:sz w:val="20"/>
-                <w:szCs w:val="20"/>
-              </w:rPr>
-              <w:t xml:space="preserve"> No</w:t>
+              <w:t>☐ Yes  ☐ No</w:t>
             </w:r>
           </w:p>
         </w:tc>
@@ -3198,23 +2890,7 @@
                 <w:sz w:val="20"/>
                 <w:szCs w:val="20"/>
               </w:rPr>
-              <w:t xml:space="preserve">B7 - Student uses plain English and translates technical terminology when necessary, communicating with the role-played superior to articulate ideas, requirements, and plans [ICTICT517 FS Oral Communication] ("Uses plain English, translating technical </w:t>
-            </w:r>
-            <w:proofErr w:type="gramStart"/>
-            <w:r>
-              <w:rPr>
-                <w:sz w:val="20"/>
-                <w:szCs w:val="20"/>
-              </w:rPr>
-              <w:t>terminology</w:t>
-            </w:r>
-            <w:proofErr w:type="gramEnd"/>
-            <w:r>
-              <w:rPr>
-                <w:sz w:val="20"/>
-                <w:szCs w:val="20"/>
-              </w:rPr>
-              <w:t xml:space="preserve"> when necessary, to communicate with a range of personnel and determine objectives, articulate ideas and requirements, and develop plans")</w:t>
+              <w:t>B7 - Student uses plain English and translates technical terminology when necessary, communicating with the role-played superior to articulate ideas, requirements, and plans [ICTICT517 FS Oral Communication] ("Uses plain English, translating technical terminology when necessary, to communicate with a range of personnel and determine objectives, articulate ideas and requirements, and develop plans")</w:t>
             </w:r>
           </w:p>
         </w:tc>
@@ -3234,23 +2910,7 @@
                 <w:sz w:val="20"/>
                 <w:szCs w:val="20"/>
               </w:rPr>
-              <w:t xml:space="preserve">☐ </w:t>
-            </w:r>
-            <w:proofErr w:type="gramStart"/>
-            <w:r>
-              <w:rPr>
-                <w:sz w:val="20"/>
-                <w:szCs w:val="20"/>
-              </w:rPr>
-              <w:t>Yes  ☐</w:t>
-            </w:r>
-            <w:proofErr w:type="gramEnd"/>
-            <w:r>
-              <w:rPr>
-                <w:sz w:val="20"/>
-                <w:szCs w:val="20"/>
-              </w:rPr>
-              <w:t xml:space="preserve"> No</w:t>
+              <w:t>☐ Yes  ☐ No</w:t>
             </w:r>
           </w:p>
         </w:tc>
@@ -3307,23 +2967,7 @@
                 <w:sz w:val="20"/>
                 <w:szCs w:val="20"/>
               </w:rPr>
-              <w:t xml:space="preserve">☐ </w:t>
-            </w:r>
-            <w:proofErr w:type="gramStart"/>
-            <w:r>
-              <w:rPr>
-                <w:sz w:val="20"/>
-                <w:szCs w:val="20"/>
-              </w:rPr>
-              <w:t>Yes  ☐</w:t>
-            </w:r>
-            <w:proofErr w:type="gramEnd"/>
-            <w:r>
-              <w:rPr>
-                <w:sz w:val="20"/>
-                <w:szCs w:val="20"/>
-              </w:rPr>
-              <w:t xml:space="preserve"> No</w:t>
+              <w:t>☐ Yes  ☐ No</w:t>
             </w:r>
           </w:p>
         </w:tc>
@@ -3380,23 +3024,7 @@
                 <w:sz w:val="20"/>
                 <w:szCs w:val="20"/>
               </w:rPr>
-              <w:t xml:space="preserve">☐ </w:t>
-            </w:r>
-            <w:proofErr w:type="gramStart"/>
-            <w:r>
-              <w:rPr>
-                <w:sz w:val="20"/>
-                <w:szCs w:val="20"/>
-              </w:rPr>
-              <w:t>Yes  ☐</w:t>
-            </w:r>
-            <w:proofErr w:type="gramEnd"/>
-            <w:r>
-              <w:rPr>
-                <w:sz w:val="20"/>
-                <w:szCs w:val="20"/>
-              </w:rPr>
-              <w:t xml:space="preserve"> No</w:t>
+              <w:t>☐ Yes  ☐ No</w:t>
             </w:r>
           </w:p>
         </w:tc>
@@ -3481,25 +3109,35 @@
           <w:sz w:val="20"/>
           <w:szCs w:val="20"/>
         </w:rPr>
-        <w:t xml:space="preserve">You are an MP Tech Solutions (MTS) consultant reporting to Pat Lin (MTS Senior Consultant). Pat liaises with Sam Walker (YAT ICT Manager) for </w:t>
-      </w:r>
-      <w:proofErr w:type="gramStart"/>
-      <w:r>
+        <w:t>You are an MP Tech Solutions (MTS) consultant reporting to Pat Lin (MTS Senior Consultant). Pat liaises with Sam Walker (YAT ICT Manager) for sign-offs. Sam will receive your Business Case and is your primary YAT-side stakeholder.</w:t>
+      </w:r>
+    </w:p>
+    <w:p>
+      <w:pPr>
+        <w:pStyle w:val="Assessortext"/>
         <w:rPr>
           <w:color w:val="000000" w:themeColor="text1"/>
           <w:sz w:val="20"/>
           <w:szCs w:val="20"/>
         </w:rPr>
-        <w:t>sign-offs</w:t>
-      </w:r>
-      <w:proofErr w:type="gramEnd"/>
-      <w:r>
+      </w:pPr>
+    </w:p>
+    <w:p>
+      <w:pPr>
+        <w:pStyle w:val="Assessortext"/>
         <w:rPr>
           <w:color w:val="000000" w:themeColor="text1"/>
           <w:sz w:val="20"/>
           <w:szCs w:val="20"/>
         </w:rPr>
-        <w:t>. Sam will receive your Business Case and is your primary YAT-side stakeholder.</w:t>
+      </w:pPr>
+      <w:r>
+        <w:rPr>
+          <w:color w:val="000000" w:themeColor="text1"/>
+          <w:sz w:val="20"/>
+          <w:szCs w:val="20"/>
+        </w:rPr>
+        <w:t>AT1 is the analysis and planning phase of the engagement. The work you produce in AT1 flows into AT2 and AT3 of this cluster — the action plan approved at the end of AT1 becomes the brief for the build work in AT2.</w:t>
       </w:r>
     </w:p>
     <w:p>
@@ -3507,10 +3145,22 @@
         <w:pStyle w:val="Assessortext"/>
         <w:rPr>
           <w:color w:val="000000" w:themeColor="text1"/>
-          <w:sz w:val="20"/>
-          <w:szCs w:val="20"/>
-        </w:rPr>
-      </w:pPr>
+        </w:rPr>
+      </w:pPr>
+    </w:p>
+    <w:p>
+      <w:pPr>
+        <w:pStyle w:val="Heading2"/>
+        <w:rPr>
+          <w:color w:val="000000" w:themeColor="text1"/>
+        </w:rPr>
+      </w:pPr>
+      <w:r>
+        <w:rPr>
+          <w:color w:val="000000" w:themeColor="text1"/>
+        </w:rPr>
+        <w:t>Part A — Business Case</w:t>
+      </w:r>
     </w:p>
     <w:p>
       <w:pPr>
@@ -3527,7 +3177,7 @@
           <w:sz w:val="20"/>
           <w:szCs w:val="20"/>
         </w:rPr>
-        <w:t>AT1 is the analysis and planning phase of the engagement. The work you produce in AT1 flows into AT2 and AT3 of this cluster — the action plan approved at the end of AT1 becomes the brief for the build work in AT2.</w:t>
+        <w:t>Using the YAT Business Case template (download from the intranet's Templates section), populate every section. The Business Case is the primary written deliverable and must contain:</w:t>
       </w:r>
     </w:p>
     <w:p>
@@ -3535,21 +3185,27 @@
         <w:pStyle w:val="Assessortext"/>
         <w:rPr>
           <w:color w:val="000000" w:themeColor="text1"/>
-        </w:rPr>
-      </w:pPr>
-    </w:p>
-    <w:p>
-      <w:pPr>
-        <w:pStyle w:val="Heading2"/>
+          <w:sz w:val="20"/>
+          <w:szCs w:val="20"/>
+        </w:rPr>
+      </w:pPr>
+    </w:p>
+    <w:p>
+      <w:pPr>
+        <w:pStyle w:val="Assessortext"/>
         <w:rPr>
           <w:color w:val="000000" w:themeColor="text1"/>
+          <w:sz w:val="20"/>
+          <w:szCs w:val="20"/>
         </w:rPr>
       </w:pPr>
       <w:r>
         <w:rPr>
           <w:color w:val="000000" w:themeColor="text1"/>
-        </w:rPr>
-        <w:t>Part A — Business Case</w:t>
+          <w:sz w:val="20"/>
+          <w:szCs w:val="20"/>
+        </w:rPr>
+        <w:t>§1 Executive Summary — a one-page summary of your recommendation (write last)</w:t>
       </w:r>
     </w:p>
     <w:p>
@@ -3567,7 +3223,7 @@
           <w:sz w:val="20"/>
           <w:szCs w:val="20"/>
         </w:rPr>
-        <w:t>Using the YAT Business Case template (download from the intranet's Templates section), populate every section. The Business Case is the primary written deliverable and must contain:</w:t>
+        <w:t>§2 Engagement context — who you are, the engagement, the decision being asked of the board</w:t>
       </w:r>
     </w:p>
     <w:p>
@@ -3579,6 +3235,14 @@
           <w:szCs w:val="20"/>
         </w:rPr>
       </w:pPr>
+      <w:r>
+        <w:rPr>
+          <w:color w:val="000000" w:themeColor="text1"/>
+          <w:sz w:val="20"/>
+          <w:szCs w:val="20"/>
+        </w:rPr>
+        <w:t>§3 Strategic Alignment Analysis — analyse YAT's ICT Strategic Plan against the industry environment and organisational objectives</w:t>
+      </w:r>
     </w:p>
     <w:p>
       <w:pPr>
@@ -3595,7 +3259,7 @@
           <w:sz w:val="20"/>
           <w:szCs w:val="20"/>
         </w:rPr>
-        <w:t>§1 Executive Summary — a one-page summary of your recommendation (write last)</w:t>
+        <w:t>§4 Current State of YAT's ICT — synthesised summary from the intranet materials (synthesis, not verbatim reproduction)</w:t>
       </w:r>
     </w:p>
     <w:p>
@@ -3613,7 +3277,7 @@
           <w:sz w:val="20"/>
           <w:szCs w:val="20"/>
         </w:rPr>
-        <w:t>§2 Engagement context — who you are, the engagement, the decision being asked of the board</w:t>
+        <w:t>§5 Gap Analysis — gaps, improvement opportunities, proposed changes</w:t>
       </w:r>
     </w:p>
     <w:p>
@@ -3631,7 +3295,7 @@
           <w:sz w:val="20"/>
           <w:szCs w:val="20"/>
         </w:rPr>
-        <w:t>§3 Strategic Alignment Analysis — analyse YAT's ICT Strategic Plan against the industry environment and organisational objectives</w:t>
+        <w:t>§6 Options Considered and Evaluation — workload definition, options assessed (in-house renewal vs cloud migration to AWS), initial impact and difficulty assessment</w:t>
       </w:r>
     </w:p>
     <w:p>
@@ -3649,7 +3313,7 @@
           <w:sz w:val="20"/>
           <w:szCs w:val="20"/>
         </w:rPr>
-        <w:t>§4 Current State of YAT's ICT — synthesised summary from the intranet materials (synthesis, not verbatim reproduction)</w:t>
+        <w:t>§7 Cost-Benefit Analysis — assumptions, summary tables for both options, avoided-downtime benefit, comparison summary, Year-1 cash-flow comparison, sensitivity analysis. The detailed line items live in Appendix 1 of the same document.</w:t>
       </w:r>
     </w:p>
     <w:p>
@@ -3667,7 +3331,7 @@
           <w:sz w:val="20"/>
           <w:szCs w:val="20"/>
         </w:rPr>
-        <w:t>§5 Gap Analysis — gaps, improvement opportunities, proposed changes</w:t>
+        <w:t>§8 Risk and Impact Assessment — intangibles comparison and risk register for the recommended option</w:t>
       </w:r>
     </w:p>
     <w:p>
@@ -3685,7 +3349,7 @@
           <w:sz w:val="20"/>
           <w:szCs w:val="20"/>
         </w:rPr>
-        <w:t>§6 Options Considered and Evaluation — workload definition, options assessed (in-house renewal vs cloud migration to AWS), initial impact and difficulty assessment</w:t>
+        <w:t>§9 Recommendation — your chosen option with rationale</w:t>
       </w:r>
     </w:p>
     <w:p>
@@ -3703,7 +3367,7 @@
           <w:sz w:val="20"/>
           <w:szCs w:val="20"/>
         </w:rPr>
-        <w:t>§7 Cost-Benefit Analysis — assumptions, summary tables for both options, avoided-downtime benefit, comparison summary, Year-1 cash-flow comparison, sensitivity analysis. The detailed line items live in Appendix 1 of the same document.</w:t>
+        <w:t>§10 Action Plan — prioritised changes, implementation schedule, standards / targets / success metrics, implementation methods, alignment with YAT's change-management procedure, risk register</w:t>
       </w:r>
     </w:p>
     <w:p>
@@ -3721,7 +3385,7 @@
           <w:sz w:val="20"/>
           <w:szCs w:val="20"/>
         </w:rPr>
-        <w:t>§8 Risk and Impact Assessment — intangibles comparison and risk register for the recommended option</w:t>
+        <w:t>§11 Next Steps and Decision Requested — what you are asking the board to decide today</w:t>
       </w:r>
     </w:p>
     <w:p>
@@ -3733,13 +3397,23 @@
           <w:szCs w:val="20"/>
         </w:rPr>
       </w:pPr>
-      <w:r>
+    </w:p>
+    <w:p>
+      <w:pPr>
+        <w:pStyle w:val="Assessortext"/>
         <w:rPr>
           <w:color w:val="000000" w:themeColor="text1"/>
           <w:sz w:val="20"/>
           <w:szCs w:val="20"/>
         </w:rPr>
-        <w:t>§9 Recommendation — your chosen option with rationale</w:t>
+      </w:pPr>
+      <w:r>
+        <w:rPr>
+          <w:color w:val="000000" w:themeColor="text1"/>
+          <w:sz w:val="20"/>
+          <w:szCs w:val="20"/>
+        </w:rPr>
+        <w:t>Sign-off block — completed during/after your presentation</w:t>
       </w:r>
     </w:p>
     <w:p>
@@ -3757,7 +3431,7 @@
           <w:sz w:val="20"/>
           <w:szCs w:val="20"/>
         </w:rPr>
-        <w:t>§10 Action Plan — prioritised changes, implementation schedule, standards / targets / success metrics, implementation methods, alignment with YAT's change-management procedure, risk register</w:t>
+        <w:t>Appendix 1 — CBA detailed line items — every cost line you researched and computed</w:t>
       </w:r>
     </w:p>
     <w:p>
@@ -3775,71 +3449,41 @@
           <w:sz w:val="20"/>
           <w:szCs w:val="20"/>
         </w:rPr>
-        <w:t>§11 Next Steps and Decision Requested — what you are asking the board to decide today</w:t>
+        <w:t>Appendix 2 — Knowledge Evidence — short-answer responses linking your work to underlying cloud and evaluation principles</w:t>
       </w:r>
     </w:p>
     <w:p>
       <w:pPr>
         <w:pStyle w:val="Assessortext"/>
         <w:rPr>
-          <w:color w:val="000000" w:themeColor="text1"/>
-          <w:sz w:val="20"/>
-          <w:szCs w:val="20"/>
-        </w:rPr>
-      </w:pPr>
-    </w:p>
-    <w:p>
-      <w:pPr>
-        <w:pStyle w:val="Assessortext"/>
-        <w:rPr>
-          <w:color w:val="000000" w:themeColor="text1"/>
-          <w:sz w:val="20"/>
-          <w:szCs w:val="20"/>
-        </w:rPr>
-      </w:pPr>
-      <w:r>
-        <w:rPr>
-          <w:color w:val="000000" w:themeColor="text1"/>
-          <w:sz w:val="20"/>
-          <w:szCs w:val="20"/>
-        </w:rPr>
-        <w:t>Sign-off block — completed during/after your presentation</w:t>
-      </w:r>
-    </w:p>
-    <w:p>
-      <w:pPr>
-        <w:pStyle w:val="Assessortext"/>
-        <w:rPr>
-          <w:color w:val="000000" w:themeColor="text1"/>
-          <w:sz w:val="20"/>
-          <w:szCs w:val="20"/>
-        </w:rPr>
-      </w:pPr>
-      <w:r>
-        <w:rPr>
-          <w:color w:val="000000" w:themeColor="text1"/>
-          <w:sz w:val="20"/>
-          <w:szCs w:val="20"/>
-        </w:rPr>
-        <w:t>Appendix 1 — CBA detailed line items — every cost line you researched and computed</w:t>
-      </w:r>
-    </w:p>
-    <w:p>
-      <w:pPr>
-        <w:pStyle w:val="Assessortext"/>
-        <w:rPr>
-          <w:color w:val="000000" w:themeColor="text1"/>
-          <w:sz w:val="20"/>
-          <w:szCs w:val="20"/>
-        </w:rPr>
-      </w:pPr>
-      <w:r>
-        <w:rPr>
-          <w:color w:val="000000" w:themeColor="text1"/>
-          <w:sz w:val="20"/>
-          <w:szCs w:val="20"/>
-        </w:rPr>
-        <w:t>Appendix 2 — Knowledge Evidence — short-answer responses linking your work to underlying cloud and evaluation principles</w:t>
+          <w:i/>
+          <w:iCs/>
+          <w:color w:val="7F7F7F" w:themeColor="text1" w:themeTint="80"/>
+          <w:sz w:val="20"/>
+          <w:szCs w:val="20"/>
+        </w:rPr>
+      </w:pPr>
+      <w:r>
+        <w:rPr>
+          <w:b/>
+          <w:bCs/>
+          <w:i/>
+          <w:iCs/>
+          <w:color w:val="7F7F7F" w:themeColor="text1" w:themeTint="80"/>
+          <w:sz w:val="20"/>
+          <w:szCs w:val="20"/>
+        </w:rPr>
+        <w:t>NOTE:</w:t>
+      </w:r>
+      <w:r>
+        <w:rPr>
+          <w:i/>
+          <w:iCs/>
+          <w:color w:val="7F7F7F" w:themeColor="text1" w:themeTint="80"/>
+          <w:sz w:val="20"/>
+          <w:szCs w:val="20"/>
+        </w:rPr>
+        <w:t xml:space="preserve"> knowledge questions are in the Business Case template used for this assessment and available on the YAT intranet </w:t>
       </w:r>
     </w:p>
     <w:p>
@@ -4149,7 +3793,6 @@
         <w:rPr>
           <w:color w:val="000000" w:themeColor="text1"/>
         </w:rPr>
-        <w:lastRenderedPageBreak/>
         <w:t>Part B — Presentation to the YAT board</w:t>
       </w:r>
     </w:p>
@@ -4900,6 +4543,7 @@
           <w:sz w:val="20"/>
           <w:szCs w:val="20"/>
         </w:rPr>
+        <w:lastRenderedPageBreak/>
         <w:t>The decision asked of the board is explicit</w:t>
       </w:r>
     </w:p>
@@ -4915,7 +4559,6 @@
           <w:sz w:val="20"/>
           <w:szCs w:val="20"/>
         </w:rPr>
-        <w:lastRenderedPageBreak/>
         <w:t>Not Yet Satisfactory:</w:t>
       </w:r>
     </w:p>
@@ -5706,7 +5349,6 @@
           <w:sz w:val="20"/>
           <w:szCs w:val="20"/>
         </w:rPr>
-        <w:lastRenderedPageBreak/>
         <w:t>6. Marking §6 Options Considered and Evaluation</w:t>
       </w:r>
     </w:p>
@@ -7463,7 +7105,6 @@
           <w:sz w:val="20"/>
           <w:szCs w:val="20"/>
         </w:rPr>
-        <w:lastRenderedPageBreak/>
         <w:t>7.3 Option B — Cloud migration to AWS (5-year worked example)</w:t>
       </w:r>
     </w:p>
@@ -9666,7 +9307,15 @@
                 <w:sz w:val="20"/>
                 <w:szCs w:val="20"/>
               </w:rPr>
-              <w:t>Avoided-downtime benefit (B vs A, 5-year)</w:t>
+              <w:t>Avoided-downtime benefit (B vs A, 5-</w:t>
+            </w:r>
+            <w:r>
+              <w:rPr>
+                <w:sz w:val="20"/>
+                <w:szCs w:val="20"/>
+              </w:rPr>
+              <w:lastRenderedPageBreak/>
+              <w:t>year)</w:t>
             </w:r>
           </w:p>
         </w:tc>
@@ -9686,6 +9335,7 @@
                 <w:sz w:val="20"/>
                 <w:szCs w:val="20"/>
               </w:rPr>
+              <w:lastRenderedPageBreak/>
               <w:t>—</w:t>
             </w:r>
           </w:p>
@@ -9728,7 +9378,6 @@
                 <w:sz w:val="20"/>
                 <w:szCs w:val="20"/>
               </w:rPr>
-              <w:lastRenderedPageBreak/>
               <w:t>Net 5-year delta in favour of cloud</w:t>
             </w:r>
           </w:p>
@@ -10792,6 +10441,7 @@
           <w:sz w:val="20"/>
           <w:szCs w:val="20"/>
         </w:rPr>
+        <w:lastRenderedPageBreak/>
         <w:t>UoC</w:t>
       </w:r>
       <w:proofErr w:type="spellEnd"/>
@@ -10815,7 +10465,6 @@
           <w:sz w:val="20"/>
           <w:szCs w:val="20"/>
         </w:rPr>
-        <w:lastRenderedPageBreak/>
         <w:t>Satisfactory looks like:</w:t>
       </w:r>
     </w:p>
@@ -11560,7 +11209,6 @@
           <w:sz w:val="20"/>
           <w:szCs w:val="20"/>
         </w:rPr>
-        <w:lastRenderedPageBreak/>
         <w:t>12.1 Selection-style questions</w:t>
       </w:r>
     </w:p>
@@ -12074,6 +11722,7 @@
           <w:sz w:val="20"/>
           <w:szCs w:val="20"/>
         </w:rPr>
+        <w:lastRenderedPageBreak/>
         <w:t xml:space="preserve">The cited content is </w:t>
       </w:r>
       <w:proofErr w:type="gramStart"/>
@@ -12117,7 +11766,6 @@
           <w:sz w:val="20"/>
           <w:szCs w:val="20"/>
         </w:rPr>
-        <w:lastRenderedPageBreak/>
         <w:t>Common deductions:</w:t>
       </w:r>
     </w:p>
@@ -12943,7 +12591,6 @@
       </w:pPr>
       <w:proofErr w:type="spellStart"/>
       <w:r>
-        <w:lastRenderedPageBreak/>
         <w:t>UoC</w:t>
       </w:r>
       <w:proofErr w:type="spellEnd"/>
@@ -13725,6 +13372,27 @@
               </w:rPr>
               <w:t>A7</w:t>
             </w:r>
+            <w:r>
+              <w:rPr>
+                <w:sz w:val="20"/>
+                <w:szCs w:val="20"/>
+              </w:rPr>
+              <w:t xml:space="preserve"> </w:t>
+            </w:r>
+            <w:r>
+              <w:rPr>
+                <w:sz w:val="20"/>
+                <w:szCs w:val="20"/>
+              </w:rPr>
+              <w:t>·</w:t>
+            </w:r>
+            <w:r>
+              <w:rPr>
+                <w:sz w:val="20"/>
+                <w:szCs w:val="20"/>
+              </w:rPr>
+              <w:t xml:space="preserve"> A8</w:t>
+            </w:r>
           </w:p>
         </w:tc>
       </w:tr>
@@ -14770,7 +14438,15 @@
                 <w:sz w:val="20"/>
                 <w:szCs w:val="20"/>
               </w:rPr>
-              <w:t>AC 4 — Data to gather information from to determine output and user requirements</w:t>
+              <w:t xml:space="preserve">AC 4 — Data to gather information from to determine output </w:t>
+            </w:r>
+            <w:r>
+              <w:rPr>
+                <w:sz w:val="20"/>
+                <w:szCs w:val="20"/>
+              </w:rPr>
+              <w:lastRenderedPageBreak/>
+              <w:t>and user requirements</w:t>
             </w:r>
           </w:p>
         </w:tc>
@@ -14790,6 +14466,7 @@
                 <w:sz w:val="20"/>
                 <w:szCs w:val="20"/>
               </w:rPr>
+              <w:lastRenderedPageBreak/>
               <w:t>C1 (pre-condition — YAT scenario materials on intranet)</w:t>
             </w:r>
           </w:p>
@@ -15564,8 +15241,7 @@
               <v:stroke joinstyle="miter"/>
               <v:path gradientshapeok="t" o:connecttype="rect"/>
             </v:shapetype>
-            <v:shape id="Text Box 2" o:spid="_x0000_s1026" type="#_x0000_t202" alt="OFFICIAL" style="position:absolute;margin-left:0;margin-top:0;width:34.95pt;height:34.95pt;z-index:251659264;visibility:visible;mso-wrap-style:none;mso-wrap-distance-left:0;mso-wrap-distance-top:0;mso-wrap-distance-right:0;mso-wrap-distance-bottom:0;mso-position-horizontal:center;mso-position-horizontal-relative:page;mso-position-vertical:top;mso-position-vertical-relative:page;v-text-anchor:top" o:gfxdata="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" filled="f" stroked="f">
-              <v:fill o:detectmouseclick="t"/>
+            <v:shape id="Text Box 2" o:spid="_x0000_s1026" type="#_x0000_t202" alt="OFFICIAL" style="position:absolute;margin-left:0;margin-top:0;width:34.95pt;height:34.95pt;z-index:251659264;visibility:visible;mso-wrap-style:none;mso-wrap-distance-left:0;mso-wrap-distance-top:0;mso-wrap-distance-right:0;mso-wrap-distance-bottom:0;mso-position-horizontal:center;mso-position-horizontal-relative:page;mso-position-vertical:top;mso-position-vertical-relative:page;v-text-anchor:top" o:gfxdata="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" filled="f" stroked="f">
               <v:textbox style="mso-fit-shape-to-text:t" inset="0,15pt,0,0">
                 <w:txbxContent>
                   <w:p>
@@ -15693,8 +15369,7 @@
               <v:stroke joinstyle="miter"/>
               <v:path gradientshapeok="t" o:connecttype="rect"/>
             </v:shapetype>
-            <v:shape id="Text Box 3" o:spid="_x0000_s1027" type="#_x0000_t202" alt="OFFICIAL" style="position:absolute;margin-left:0;margin-top:0;width:34.95pt;height:34.95pt;z-index:251660288;visibility:visible;mso-wrap-style:none;mso-wrap-distance-left:0;mso-wrap-distance-top:0;mso-wrap-distance-right:0;mso-wrap-distance-bottom:0;mso-position-horizontal:center;mso-position-horizontal-relative:page;mso-position-vertical:top;mso-position-vertical-relative:page;v-text-anchor:top" o:gfxdata="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" filled="f" stroked="f">
-              <v:fill o:detectmouseclick="t"/>
+            <v:shape id="Text Box 3" o:spid="_x0000_s1027" type="#_x0000_t202" alt="OFFICIAL" style="position:absolute;margin-left:0;margin-top:0;width:34.95pt;height:34.95pt;z-index:251660288;visibility:visible;mso-wrap-style:none;mso-wrap-distance-left:0;mso-wrap-distance-top:0;mso-wrap-distance-right:0;mso-wrap-distance-bottom:0;mso-position-horizontal:center;mso-position-horizontal-relative:page;mso-position-vertical:top;mso-position-vertical-relative:page;v-text-anchor:top" o:gfxdata="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" filled="f" stroked="f">
               <v:textbox style="mso-fit-shape-to-text:t" inset="0,15pt,0,0">
                 <w:txbxContent>
                   <w:p>
@@ -15822,8 +15497,7 @@
               <v:stroke joinstyle="miter"/>
               <v:path gradientshapeok="t" o:connecttype="rect"/>
             </v:shapetype>
-            <v:shape id="Text Box 1" o:spid="_x0000_s1028" type="#_x0000_t202" alt="OFFICIAL" style="position:absolute;margin-left:0;margin-top:0;width:34.95pt;height:34.95pt;z-index:251658240;visibility:visible;mso-wrap-style:none;mso-wrap-distance-left:0;mso-wrap-distance-top:0;mso-wrap-distance-right:0;mso-wrap-distance-bottom:0;mso-position-horizontal:center;mso-position-horizontal-relative:page;mso-position-vertical:top;mso-position-vertical-relative:page;v-text-anchor:top" o:gfxdata="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" filled="f" stroked="f">
-              <v:fill o:detectmouseclick="t"/>
+            <v:shape id="Text Box 1" o:spid="_x0000_s1028" type="#_x0000_t202" alt="OFFICIAL" style="position:absolute;margin-left:0;margin-top:0;width:34.95pt;height:34.95pt;z-index:251658240;visibility:visible;mso-wrap-style:none;mso-wrap-distance-left:0;mso-wrap-distance-top:0;mso-wrap-distance-right:0;mso-wrap-distance-bottom:0;mso-position-horizontal:center;mso-position-horizontal-relative:page;mso-position-vertical:top;mso-position-vertical-relative:page;v-text-anchor:top" o:gfxdata="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" filled="f" stroked="f">
               <v:textbox style="mso-fit-shape-to-text:t" inset="0,15pt,0,0">
                 <w:txbxContent>
                   <w:p>
@@ -17496,15 +17170,6 @@
 </file>
 
 <file path=customXml/item1.xml><?xml version="1.0" encoding="utf-8"?>
-<?mso-contentType ?>
-<FormTemplates xmlns="http://schemas.microsoft.com/sharepoint/v3/contenttype/forms">
-  <Display>DocumentLibraryForm</Display>
-  <Edit>DocumentLibraryForm</Edit>
-  <New>DocumentLibraryForm</New>
-</FormTemplates>
-</file>
-
-<file path=customXml/item2.xml><?xml version="1.0" encoding="utf-8"?>
 <ct:contentTypeSchema xmlns:ct="http://schemas.microsoft.com/office/2006/metadata/contentType" xmlns:ma="http://schemas.microsoft.com/office/2006/metadata/properties/metaAttributes" ct:_="" ma:_="" ma:contentTypeName="Document" ma:contentTypeID="0x010100D17E1B4D89D91D49A316865B50B76B78" ma:contentTypeVersion="26" ma:contentTypeDescription="Create a new document." ma:contentTypeScope="" ma:versionID="2e43e94bda34b09537a48d601b321f81">
   <xsd:schema xmlns:xsd="http://www.w3.org/2001/XMLSchema" xmlns:xs="http://www.w3.org/2001/XMLSchema" xmlns:p="http://schemas.microsoft.com/office/2006/metadata/properties" xmlns:ns2="bef73783-b83a-4f38-94d5-1aaaa1b3b0a2" xmlns:ns3="2933ac1b-cace-482f-bed9-bf9b7d80f34a" targetNamespace="http://schemas.microsoft.com/office/2006/metadata/properties" ma:root="true" ma:fieldsID="68ad2338b471bae35515ce7eaf1f964b" ns2:_="" ns3:_="">
     <xsd:import namespace="bef73783-b83a-4f38-94d5-1aaaa1b3b0a2"/>
@@ -17719,11 +17384,16 @@
 </ct:contentTypeSchema>
 </file>
 
-<file path=customXml/item3.xml><?xml version="1.0" encoding="utf-8"?>
-<b:Sources xmlns:b="http://schemas.openxmlformats.org/officeDocument/2006/bibliography" xmlns="http://schemas.openxmlformats.org/officeDocument/2006/bibliography" SelectedStyle="\APA.XSL" StyleName="APA"/>
+<file path=customXml/item2.xml><?xml version="1.0" encoding="utf-8"?>
+<?mso-contentType ?>
+<FormTemplates xmlns="http://schemas.microsoft.com/sharepoint/v3/contenttype/forms">
+  <Display>DocumentLibraryForm</Display>
+  <Edit>DocumentLibraryForm</Edit>
+  <New>DocumentLibraryForm</New>
+</FormTemplates>
 </file>
 
-<file path=customXml/item4.xml><?xml version="1.0" encoding="utf-8"?>
+<file path=customXml/item3.xml><?xml version="1.0" encoding="utf-8"?>
 <p:properties xmlns:p="http://schemas.microsoft.com/office/2006/metadata/properties" xmlns:xsi="http://www.w3.org/2001/XMLSchema-instance" xmlns:pc="http://schemas.microsoft.com/office/infopath/2007/PartnerControls">
   <documentManagement>
     <Category0 xmlns="bef73783-b83a-4f38-94d5-1aaaa1b3b0a2">1</Category0>
@@ -17742,15 +17412,11 @@
 </p:properties>
 </file>
 
-<file path=customXml/itemProps1.xml><?xml version="1.0" encoding="utf-8"?>
-<ds:datastoreItem xmlns:ds="http://schemas.openxmlformats.org/officeDocument/2006/customXml" ds:itemID="{34D3D63F-E7F5-44D5-94D5-721BEC103C7E}">
-  <ds:schemaRefs>
-    <ds:schemaRef ds:uri="http://schemas.microsoft.com/sharepoint/v3/contenttype/forms"/>
-  </ds:schemaRefs>
-</ds:datastoreItem>
+<file path=customXml/item4.xml><?xml version="1.0" encoding="utf-8"?>
+<b:Sources xmlns:b="http://schemas.openxmlformats.org/officeDocument/2006/bibliography" xmlns="http://schemas.openxmlformats.org/officeDocument/2006/bibliography" SelectedStyle="\APA.XSL" StyleName="APA"/>
 </file>
 
-<file path=customXml/itemProps2.xml><?xml version="1.0" encoding="utf-8"?>
+<file path=customXml/itemProps1.xml><?xml version="1.0" encoding="utf-8"?>
 <ds:datastoreItem xmlns:ds="http://schemas.openxmlformats.org/officeDocument/2006/customXml" ds:itemID="{D94EDA87-AAAA-43E1-87A4-F317188D990F}">
   <ds:schemaRefs>
     <ds:schemaRef ds:uri="http://schemas.microsoft.com/office/2006/metadata/contentType"/>
@@ -17769,15 +17435,15 @@
 </ds:datastoreItem>
 </file>
 
-<file path=customXml/itemProps3.xml><?xml version="1.0" encoding="utf-8"?>
-<ds:datastoreItem xmlns:ds="http://schemas.openxmlformats.org/officeDocument/2006/customXml" ds:itemID="{AB43DB7F-4F95-4680-AC5A-0DAC465244CE}">
+<file path=customXml/itemProps2.xml><?xml version="1.0" encoding="utf-8"?>
+<ds:datastoreItem xmlns:ds="http://schemas.openxmlformats.org/officeDocument/2006/customXml" ds:itemID="{34D3D63F-E7F5-44D5-94D5-721BEC103C7E}">
   <ds:schemaRefs>
-    <ds:schemaRef ds:uri="http://schemas.openxmlformats.org/officeDocument/2006/bibliography"/>
+    <ds:schemaRef ds:uri="http://schemas.microsoft.com/sharepoint/v3/contenttype/forms"/>
   </ds:schemaRefs>
 </ds:datastoreItem>
 </file>
 
-<file path=customXml/itemProps4.xml><?xml version="1.0" encoding="utf-8"?>
+<file path=customXml/itemProps3.xml><?xml version="1.0" encoding="utf-8"?>
 <ds:datastoreItem xmlns:ds="http://schemas.openxmlformats.org/officeDocument/2006/customXml" ds:itemID="{62592C51-5DF4-40C0-8E84-942E6938BC04}">
   <ds:schemaRefs>
     <ds:schemaRef ds:uri="http://schemas.microsoft.com/office/2006/metadata/properties"/>
@@ -17786,4 +17452,12 @@
     <ds:schemaRef ds:uri="2933ac1b-cace-482f-bed9-bf9b7d80f34a"/>
   </ds:schemaRefs>
 </ds:datastoreItem>
+</file>
+
+<file path=customXml/itemProps4.xml><?xml version="1.0" encoding="utf-8"?>
+<ds:datastoreItem xmlns:ds="http://schemas.openxmlformats.org/officeDocument/2006/customXml" ds:itemID="{AB43DB7F-4F95-4680-AC5A-0DAC465244CE}">
+  <ds:schemaRefs>
+    <ds:schemaRef ds:uri="http://schemas.openxmlformats.org/officeDocument/2006/bibliography"/>
+  </ds:schemaRefs>
+</ds:datastoreItem>
 </file>
</xml_diff>